<commit_message>
Merge Final Project Report into rubric-ordered single PDF, fix docs
- Final_Project_Report.docx/.pdf: consolidate Functional/Non-Functional
  Requirements (from SRS), Architecture + Data Flow diagrams, Tech Stack
  Justification, and the AWS Well-Architected Framework pillars into one
  report with a real, page-numbered Table of Contents, plus a new
  AI-Assisted Development Disclosure section
- SRS: tag UC-01–UC-04 as Must-have; add NFR-SCALE-04 capacity/growth
  assumption tied to the DynamoDB/Lambda scaling decision
- Tech Stack doc: fix outdated Cognito row (self-registration + auto
  group assignment now exists; previously described as manual)
- Replace hand-drawn architecture diagram with a cleaner draw.io version
  (architecture.drawio / .png)

Co-Authored-By: Claude Sonnet 5 <noreply@anthropic.com>
</commit_message>
<xml_diff>
--- a/docxs/Software_Requirements_Specification.docx
+++ b/docxs/Software_Requirements_Specification.docx
@@ -4394,25 +4394,6 @@
     </w:p>
     <w:p>
       <w:pPr>
-        <w:spacing w:after="120"/>
-      </w:pPr>
-    </w:p>
-    <w:p>
-      <w:pPr>
-        <w:pStyle w:val="Heading2"/>
-        <w:rPr>
-          <w:color w:val="auto"/>
-        </w:rPr>
-      </w:pPr>
-      <w:r>
-        <w:rPr>
-          <w:color w:val="auto"/>
-        </w:rPr>
-        <w:t>4.4 Availability</w:t>
-      </w:r>
-    </w:p>
-    <w:p>
-      <w:pPr>
         <w:pStyle w:val="ListParagraph"/>
         <w:numPr>
           <w:ilvl w:val="0"/>
@@ -4421,7 +4402,26 @@
         <w:spacing w:after="80"/>
       </w:pPr>
       <w:r>
-        <w:t>NFR-AVAIL-01: Target availability &gt;= 99.9% (AWS SLA for Lambda, API Gateway, DynamoDB).</w:t>
+        <w:t xml:space="preserve">NFR-SCALE-04: Capacity assumption — the system is sized for an assumed peak of 50 concurrent resume analyses during career-fair/demo events, growing to approximately 150 concurrent analyses (3×) over the first year as usage scales beyond the pilot; this projection, not just platform ceilings, is why DynamoDB on-demand capacity and Lambda’s default concurrency scaling were chosen over provisioned capacity — both absorb that growth without a capacity-planning change.</w:t>
+      </w:r>
+    </w:p>
+    <w:p>
+      <w:pPr>
+        <w:spacing w:after="120"/>
+      </w:pPr>
+    </w:p>
+    <w:p>
+      <w:pPr>
+        <w:pStyle w:val="Heading2"/>
+        <w:rPr>
+          <w:color w:val="auto"/>
+        </w:rPr>
+      </w:pPr>
+      <w:r>
+        <w:rPr>
+          <w:color w:val="auto"/>
+        </w:rPr>
+        <w:t>4.4 Availability</w:t>
       </w:r>
     </w:p>
     <w:p>
@@ -4434,26 +4434,7 @@
         <w:spacing w:after="80"/>
       </w:pPr>
       <w:r>
-        <w:t>NFR-AVAIL-02: CloudWatch alarms notify on Lambda errors, Step Functions failures, and DynamoDB throttles.</w:t>
-      </w:r>
-    </w:p>
-    <w:p>
-      <w:pPr>
-        <w:spacing w:after="120"/>
-      </w:pPr>
-    </w:p>
-    <w:p>
-      <w:pPr>
-        <w:pStyle w:val="Heading2"/>
-        <w:rPr>
-          <w:color w:val="auto"/>
-        </w:rPr>
-      </w:pPr>
-      <w:r>
-        <w:rPr>
-          <w:color w:val="auto"/>
-        </w:rPr>
-        <w:t>4.5 Maintainability</w:t>
+        <w:t>NFR-AVAIL-01: Target availability &gt;= 99.9% (AWS SLA for Lambda, API Gateway, DynamoDB).</w:t>
       </w:r>
     </w:p>
     <w:p>
@@ -4466,15 +4447,26 @@
         <w:spacing w:after="80"/>
       </w:pPr>
       <w:r>
-        <w:t xml:space="preserve">NFR-MAINT-01: All infrastructure defined in Terraform </w:t>
-      </w:r>
-      <w:proofErr w:type="spellStart"/>
-      <w:r>
-        <w:t>IaC</w:t>
-      </w:r>
-      <w:proofErr w:type="spellEnd"/>
-      <w:r>
-        <w:t xml:space="preserve"> - reproducible from a single 'terraform apply'.</w:t>
+        <w:t>NFR-AVAIL-02: CloudWatch alarms notify on Lambda errors, Step Functions failures, and DynamoDB throttles.</w:t>
+      </w:r>
+    </w:p>
+    <w:p>
+      <w:pPr>
+        <w:spacing w:after="120"/>
+      </w:pPr>
+    </w:p>
+    <w:p>
+      <w:pPr>
+        <w:pStyle w:val="Heading2"/>
+        <w:rPr>
+          <w:color w:val="auto"/>
+        </w:rPr>
+      </w:pPr>
+      <w:r>
+        <w:rPr>
+          <w:color w:val="auto"/>
+        </w:rPr>
+        <w:t>4.5 Maintainability</w:t>
       </w:r>
     </w:p>
     <w:p>
@@ -4487,15 +4479,15 @@
         <w:spacing w:after="80"/>
       </w:pPr>
       <w:r>
-        <w:t xml:space="preserve">NFR-MAINT-02: GitHub Actions CI/CD pipeline runs </w:t>
-      </w:r>
-      <w:proofErr w:type="gramStart"/>
-      <w:r>
-        <w:t>71 unit</w:t>
-      </w:r>
-      <w:proofErr w:type="gramEnd"/>
-      <w:r>
-        <w:t xml:space="preserve"> tests before any deployment.</w:t>
+        <w:t xml:space="preserve">NFR-MAINT-01: All infrastructure defined in Terraform </w:t>
+      </w:r>
+      <w:proofErr w:type="spellStart"/>
+      <w:r>
+        <w:t>IaC</w:t>
+      </w:r>
+      <w:proofErr w:type="spellEnd"/>
+      <w:r>
+        <w:t xml:space="preserve"> - reproducible from a single 'terraform apply'.</w:t>
       </w:r>
     </w:p>
     <w:p>
@@ -4508,6 +4500,27 @@
         <w:spacing w:after="80"/>
       </w:pPr>
       <w:r>
+        <w:t xml:space="preserve">NFR-MAINT-02: GitHub Actions CI/CD pipeline runs </w:t>
+      </w:r>
+      <w:proofErr w:type="gramStart"/>
+      <w:r>
+        <w:t>71 unit</w:t>
+      </w:r>
+      <w:proofErr w:type="gramEnd"/>
+      <w:r>
+        <w:t xml:space="preserve"> tests before any deployment.</w:t>
+      </w:r>
+    </w:p>
+    <w:p>
+      <w:pPr>
+        <w:pStyle w:val="ListParagraph"/>
+        <w:numPr>
+          <w:ilvl w:val="0"/>
+          <w:numId w:val="2"/>
+        </w:numPr>
+        <w:spacing w:after="80"/>
+      </w:pPr>
+      <w:r>
         <w:t>NFR-MAINT-03: Terraform state stored remotely in S3 for team collaboration.</w:t>
       </w:r>
     </w:p>
@@ -4553,10 +4566,10 @@
           <w:b/>
           <w:bCs/>
         </w:rPr>
-        <w:t xml:space="preserve">Actor: </w:t>
-      </w:r>
-      <w:r>
-        <w:t>Student</w:t>
+        <w:t xml:space="preserve">Priority: </w:t>
+      </w:r>
+      <w:r>
+        <w:t>Must-have</w:t>
       </w:r>
     </w:p>
     <w:p>
@@ -4568,10 +4581,10 @@
           <w:b/>
           <w:bCs/>
         </w:rPr>
-        <w:t xml:space="preserve">Precondition: </w:t>
-      </w:r>
-      <w:r>
-        <w:t>Logged in as student</w:t>
+        <w:t xml:space="preserve">Actor: </w:t>
+      </w:r>
+      <w:r>
+        <w:t>Student</w:t>
       </w:r>
     </w:p>
     <w:p>
@@ -4583,29 +4596,44 @@
           <w:b/>
           <w:bCs/>
         </w:rPr>
-        <w:t xml:space="preserve">Main Flow: </w:t>
-      </w:r>
-      <w:r>
-        <w:t xml:space="preserve">(1) Student selects job description source. (2) Student uploads resume PDF. (3) Clicks Analyze Resume. (4) System shows loading overlay. (5) System extracts text via </w:t>
-      </w:r>
-      <w:proofErr w:type="spellStart"/>
-      <w:r>
-        <w:t>Textract</w:t>
-      </w:r>
-      <w:proofErr w:type="spellEnd"/>
-      <w:r>
-        <w:t>. (6) System scores via Hugging Face LLM. (7) System stores result and notifies via SNS. (8) System displays score, skills, and recommendations.</w:t>
-      </w:r>
-    </w:p>
-    <w:p>
-      <w:pPr>
-        <w:spacing w:after="200"/>
+        <w:t xml:space="preserve">Precondition: </w:t>
+      </w:r>
+      <w:r>
+        <w:t>Logged in as student</w:t>
+      </w:r>
+    </w:p>
+    <w:p>
+      <w:pPr>
+        <w:spacing w:after="80"/>
       </w:pPr>
       <w:r>
         <w:rPr>
           <w:b/>
           <w:bCs/>
         </w:rPr>
+        <w:t xml:space="preserve">Main Flow: </w:t>
+      </w:r>
+      <w:r>
+        <w:t xml:space="preserve">(1) Student selects job description source. (2) Student uploads resume PDF. (3) Clicks Analyze Resume. (4) System shows loading overlay. (5) System extracts text via </w:t>
+      </w:r>
+      <w:proofErr w:type="spellStart"/>
+      <w:r>
+        <w:t>Textract</w:t>
+      </w:r>
+      <w:proofErr w:type="spellEnd"/>
+      <w:r>
+        <w:t>. (6) System scores via Hugging Face LLM. (7) System stores result and notifies via SNS. (8) System displays score, skills, and recommendations.</w:t>
+      </w:r>
+    </w:p>
+    <w:p>
+      <w:pPr>
+        <w:spacing w:after="200"/>
+      </w:pPr>
+      <w:r>
+        <w:rPr>
+          <w:b/>
+          <w:bCs/>
+        </w:rPr>
         <w:lastRenderedPageBreak/>
         <w:t xml:space="preserve">Alternate Flow: </w:t>
       </w:r>
@@ -4652,10 +4680,10 @@
           <w:b/>
           <w:bCs/>
         </w:rPr>
-        <w:t xml:space="preserve">Actor: </w:t>
-      </w:r>
-      <w:r>
-        <w:t>Recruiter</w:t>
+        <w:t xml:space="preserve">Priority: </w:t>
+      </w:r>
+      <w:r>
+        <w:t>Must-have</w:t>
       </w:r>
     </w:p>
     <w:p>
@@ -4667,32 +4695,10 @@
           <w:b/>
           <w:bCs/>
         </w:rPr>
-        <w:t xml:space="preserve">Main Flow: </w:t>
-      </w:r>
-      <w:r>
-        <w:t xml:space="preserve">(1) Recruiter clicks Post New Job. (2) Fills in job ID, title, description, skills, and location. (3) System validates and calls POST /jobs. (4) System stores job in DynamoDB </w:t>
-      </w:r>
-      <w:proofErr w:type="spellStart"/>
-      <w:r>
-        <w:t>JobsTable</w:t>
-      </w:r>
-      <w:proofErr w:type="spellEnd"/>
-      <w:r>
-        <w:t>.</w:t>
-      </w:r>
-    </w:p>
-    <w:p>
-      <w:pPr>
-        <w:pStyle w:val="Heading3"/>
-        <w:rPr>
-          <w:color w:val="auto"/>
-        </w:rPr>
-      </w:pPr>
-      <w:r>
-        <w:rPr>
-          <w:color w:val="auto"/>
-        </w:rPr>
-        <w:t>UC-03: Recruiter Bulk-Uploads Resumes</w:t>
+        <w:t xml:space="preserve">Actor: </w:t>
+      </w:r>
+      <w:r>
+        <w:t>Recruiter</w:t>
       </w:r>
     </w:p>
     <w:p>
@@ -4704,10 +4710,32 @@
           <w:b/>
           <w:bCs/>
         </w:rPr>
-        <w:t xml:space="preserve">Actor: </w:t>
-      </w:r>
-      <w:r>
-        <w:t>Recruiter</w:t>
+        <w:t xml:space="preserve">Main Flow: </w:t>
+      </w:r>
+      <w:r>
+        <w:t xml:space="preserve">(1) Recruiter clicks Post New Job. (2) Fills in job ID, title, description, skills, and location. (3) System validates and calls POST /jobs. (4) System stores job in DynamoDB </w:t>
+      </w:r>
+      <w:proofErr w:type="spellStart"/>
+      <w:r>
+        <w:t>JobsTable</w:t>
+      </w:r>
+      <w:proofErr w:type="spellEnd"/>
+      <w:r>
+        <w:t>.</w:t>
+      </w:r>
+    </w:p>
+    <w:p>
+      <w:pPr>
+        <w:pStyle w:val="Heading3"/>
+        <w:rPr>
+          <w:color w:val="auto"/>
+        </w:rPr>
+      </w:pPr>
+      <w:r>
+        <w:rPr>
+          <w:color w:val="auto"/>
+        </w:rPr>
+        <w:t>UC-03: Recruiter Bulk-Uploads Resumes</w:t>
       </w:r>
     </w:p>
     <w:p>
@@ -4719,6 +4747,36 @@
           <w:b/>
           <w:bCs/>
         </w:rPr>
+        <w:t xml:space="preserve">Priority: </w:t>
+      </w:r>
+      <w:r>
+        <w:t>Must-have</w:t>
+      </w:r>
+    </w:p>
+    <w:p>
+      <w:pPr>
+        <w:spacing w:after="80"/>
+      </w:pPr>
+      <w:r>
+        <w:rPr>
+          <w:b/>
+          <w:bCs/>
+        </w:rPr>
+        <w:t xml:space="preserve">Actor: </w:t>
+      </w:r>
+      <w:r>
+        <w:t>Recruiter</w:t>
+      </w:r>
+    </w:p>
+    <w:p>
+      <w:pPr>
+        <w:spacing w:after="80"/>
+      </w:pPr>
+      <w:r>
+        <w:rPr>
+          <w:b/>
+          <w:bCs/>
+        </w:rPr>
         <w:t xml:space="preserve">Main Flow: </w:t>
       </w:r>
       <w:r>
@@ -4737,6 +4795,21 @@
           <w:color w:val="auto"/>
         </w:rPr>
         <w:t>UC-04: Recruiter Views Ranked Candidates</w:t>
+      </w:r>
+    </w:p>
+    <w:p>
+      <w:pPr>
+        <w:spacing w:after="80"/>
+      </w:pPr>
+      <w:r>
+        <w:rPr>
+          <w:b/>
+          <w:bCs/>
+        </w:rPr>
+        <w:t xml:space="preserve">Priority: </w:t>
+      </w:r>
+      <w:r>
+        <w:t>Must-have</w:t>
       </w:r>
     </w:p>
     <w:p>

</xml_diff>